<commit_message>
Regenerate all 12 examples at 50 Hz and document metric explanations and developer workflow
</commit_message>
<xml_diff>
--- a/reports/BeyondTouch-project-report.docx
+++ b/reports/BeyondTouch-project-report.docx
@@ -93,7 +93,7 @@
     </w:p>
     <w:p>
       <w:r>
-        <w:t>The runner is Home_11, the receiver Home_10 and the carrier Home_8, except the mirrored example, which uses Away_11, Away_10 and Away_8. Full rosters are recorded in each instance.json file. The analysis covers local time 0 to 3.48 seconds, the last 25 Hz sample before the authored pass release at 3.5 seconds. Later animation is context only.</w:t>
+        <w:t>The runner is Home_11, the receiver Home_10 and the carrier Home_8, except the mirrored example, which uses Away_11, Away_10 and Away_8. Full rosters are recorded in each instance.json file. The analysis covers local time 0 to 3.48 seconds, the last 50 Hz sample before the authored pass release at 3.5 seconds. There are 301 samples over six seconds, including 175 samples across the analyzed 3.48-second window. These are synthetic trajectories evaluated every 0.02 seconds, not camera observations. Later animation is context only.</w:t>
       </w:r>
     </w:p>
     <w:p>
@@ -172,7 +172,7 @@
     </w:p>
     <w:p>
       <w:r>
-        <w:t>The thresholds are explicit heuristics. They are not validated pass-completion probabilities. The lane rule does not model full ball-flight interception. At 25 Hz, the sampling resolution is 0.04 seconds; threshold crossings can occur between samples.</w:t>
+        <w:t>The thresholds are explicit heuristics. They are not validated pass-completion probabilities. The lane rule does not model full ball-flight interception. At 50 Hz, the sampling resolution is 0.02 seconds; threshold crossings can occur between samples.</w:t>
       </w:r>
     </w:p>
     <w:p>
@@ -506,7 +506,7 @@
                 <w:b w:val="0"/>
                 <w:sz w:val="18"/>
               </w:rPr>
-              <w:t>+284.03</w:t>
+              <w:t>+275.06</w:t>
             </w:r>
           </w:p>
         </w:tc>
@@ -568,7 +568,7 @@
                 <w:b w:val="0"/>
                 <w:sz w:val="18"/>
               </w:rPr>
-              <w:t>2.24</w:t>
+              <w:t>2.26</w:t>
             </w:r>
           </w:p>
         </w:tc>
@@ -599,7 +599,7 @@
                 <w:b w:val="0"/>
                 <w:sz w:val="18"/>
               </w:rPr>
-              <w:t>0.02</w:t>
+              <w:t>0.03</w:t>
             </w:r>
           </w:p>
         </w:tc>
@@ -697,7 +697,7 @@
                 <w:b w:val="0"/>
                 <w:sz w:val="18"/>
               </w:rPr>
-              <w:t>+310.50</w:t>
+              <w:t>+317.38</w:t>
             </w:r>
           </w:p>
         </w:tc>
@@ -759,7 +759,7 @@
                 <w:b w:val="0"/>
                 <w:sz w:val="18"/>
               </w:rPr>
-              <w:t>2.24</w:t>
+              <w:t>2.26</w:t>
             </w:r>
           </w:p>
         </w:tc>
@@ -888,7 +888,7 @@
                 <w:b w:val="0"/>
                 <w:sz w:val="18"/>
               </w:rPr>
-              <w:t>-43.96</w:t>
+              <w:t>-45.09</w:t>
             </w:r>
           </w:p>
         </w:tc>
@@ -950,7 +950,7 @@
                 <w:b w:val="0"/>
                 <w:sz w:val="18"/>
               </w:rPr>
-              <w:t>2.24</w:t>
+              <w:t>2.26</w:t>
             </w:r>
           </w:p>
         </w:tc>
@@ -981,7 +981,7 @@
                 <w:b w:val="0"/>
                 <w:sz w:val="18"/>
               </w:rPr>
-              <w:t>2.31</w:t>
+              <w:t>2.46</w:t>
             </w:r>
           </w:p>
         </w:tc>
@@ -1079,7 +1079,7 @@
                 <w:b w:val="0"/>
                 <w:sz w:val="18"/>
               </w:rPr>
-              <w:t>+80.98</w:t>
+              <w:t>+69.10</w:t>
             </w:r>
           </w:p>
         </w:tc>
@@ -1141,7 +1141,7 @@
                 <w:b w:val="0"/>
                 <w:sz w:val="18"/>
               </w:rPr>
-              <w:t>2.24</w:t>
+              <w:t>2.26</w:t>
             </w:r>
           </w:p>
         </w:tc>
@@ -1172,7 +1172,7 @@
                 <w:b w:val="0"/>
                 <w:sz w:val="18"/>
               </w:rPr>
-              <w:t>0.35</w:t>
+              <w:t>0.29</w:t>
             </w:r>
           </w:p>
         </w:tc>
@@ -1332,7 +1332,7 @@
                 <w:b w:val="0"/>
                 <w:sz w:val="18"/>
               </w:rPr>
-              <w:t>2.24</w:t>
+              <w:t>2.26</w:t>
             </w:r>
           </w:p>
         </w:tc>
@@ -1461,7 +1461,7 @@
                 <w:b w:val="0"/>
                 <w:sz w:val="18"/>
               </w:rPr>
-              <w:t>-70.13</w:t>
+              <w:t>-74.43</w:t>
             </w:r>
           </w:p>
         </w:tc>
@@ -1523,7 +1523,7 @@
                 <w:b w:val="0"/>
                 <w:sz w:val="18"/>
               </w:rPr>
-              <w:t>2.24</w:t>
+              <w:t>2.26</w:t>
             </w:r>
           </w:p>
         </w:tc>
@@ -1554,7 +1554,7 @@
                 <w:b w:val="0"/>
                 <w:sz w:val="18"/>
               </w:rPr>
-              <w:t>3.69</w:t>
+              <w:t>3.44</w:t>
             </w:r>
           </w:p>
         </w:tc>
@@ -1652,7 +1652,7 @@
                 <w:b w:val="0"/>
                 <w:sz w:val="18"/>
               </w:rPr>
-              <w:t>+330.92</w:t>
+              <w:t>+334.95</w:t>
             </w:r>
           </w:p>
         </w:tc>
@@ -1714,7 +1714,7 @@
                 <w:b w:val="0"/>
                 <w:sz w:val="18"/>
               </w:rPr>
-              <w:t>2.24</w:t>
+              <w:t>2.26</w:t>
             </w:r>
           </w:p>
         </w:tc>
@@ -1745,7 +1745,7 @@
                 <w:b w:val="0"/>
                 <w:sz w:val="18"/>
               </w:rPr>
-              <w:t>0.04</w:t>
+              <w:t>0.05</w:t>
             </w:r>
           </w:p>
         </w:tc>
@@ -1843,7 +1843,7 @@
                 <w:b w:val="0"/>
                 <w:sz w:val="18"/>
               </w:rPr>
-              <w:t>+291.09</w:t>
+              <w:t>+282.14</w:t>
             </w:r>
           </w:p>
         </w:tc>
@@ -1936,7 +1936,7 @@
                 <w:b w:val="0"/>
                 <w:sz w:val="18"/>
               </w:rPr>
-              <w:t>0.02</w:t>
+              <w:t>0.03</w:t>
             </w:r>
           </w:p>
         </w:tc>
@@ -2034,7 +2034,7 @@
                 <w:b w:val="0"/>
                 <w:sz w:val="18"/>
               </w:rPr>
-              <w:t>+284.03</w:t>
+              <w:t>+275.06</w:t>
             </w:r>
           </w:p>
         </w:tc>
@@ -2096,7 +2096,7 @@
                 <w:b w:val="0"/>
                 <w:sz w:val="18"/>
               </w:rPr>
-              <w:t>2.24</w:t>
+              <w:t>2.26</w:t>
             </w:r>
           </w:p>
         </w:tc>
@@ -2127,7 +2127,7 @@
                 <w:b w:val="0"/>
                 <w:sz w:val="18"/>
               </w:rPr>
-              <w:t>0.06</w:t>
+              <w:t>0.04</w:t>
             </w:r>
           </w:p>
         </w:tc>
@@ -2225,7 +2225,7 @@
                 <w:b w:val="0"/>
                 <w:sz w:val="18"/>
               </w:rPr>
-              <w:t>+281.24</w:t>
+              <w:t>+272.34</w:t>
             </w:r>
           </w:p>
         </w:tc>
@@ -2318,7 +2318,7 @@
                 <w:b w:val="0"/>
                 <w:sz w:val="18"/>
               </w:rPr>
-              <w:t>0.02</w:t>
+              <w:t>0.03</w:t>
             </w:r>
           </w:p>
         </w:tc>
@@ -2478,7 +2478,7 @@
                 <w:b w:val="0"/>
                 <w:sz w:val="18"/>
               </w:rPr>
-              <w:t>2.24</w:t>
+              <w:t>2.26</w:t>
             </w:r>
           </w:p>
         </w:tc>
@@ -2607,7 +2607,7 @@
                 <w:b w:val="0"/>
                 <w:sz w:val="18"/>
               </w:rPr>
-              <w:t>+214.40</w:t>
+              <w:t>+207.22</w:t>
             </w:r>
           </w:p>
         </w:tc>
@@ -2700,7 +2700,7 @@
                 <w:b w:val="0"/>
                 <w:sz w:val="18"/>
               </w:rPr>
-              <w:t>0.03</w:t>
+              <w:t>0.05</w:t>
             </w:r>
           </w:p>
         </w:tc>
@@ -2741,7 +2741,7 @@
     </w:p>
     <w:p>
       <w:r>
-        <w:t>Across the twelve examples, 11 meet the declared grid-stability tolerance: an absolute net-area difference no greater than the larger of 3 square metres or 5 percent of the finer-grid result. We report failures as well as passes. This threshold is a project diagnostic, not an established football-analytics standard.</w:t>
+        <w:t>Across the twelve examples, 12 meet the declared grid-stability tolerance: an absolute net-area difference no greater than the larger of 3 square metres or 5 percent of the finer-grid result. We report failures as well as passes. This threshold is a project diagnostic, not an established football-analytics standard.</w:t>
       </w:r>
     </w:p>
     <w:p>
@@ -2925,7 +2925,7 @@
                 <w:b w:val="0"/>
                 <w:sz w:val="18"/>
               </w:rPr>
-              <w:t>+284.03</w:t>
+              <w:t>+275.06</w:t>
             </w:r>
           </w:p>
         </w:tc>
@@ -2956,7 +2956,7 @@
                 <w:b w:val="0"/>
                 <w:sz w:val="18"/>
               </w:rPr>
-              <w:t>2.24</w:t>
+              <w:t>2.26</w:t>
             </w:r>
           </w:p>
         </w:tc>
@@ -3023,7 +3023,7 @@
                 <w:b w:val="0"/>
                 <w:sz w:val="18"/>
               </w:rPr>
-              <w:t>+282.86</w:t>
+              <w:t>+273.93</w:t>
             </w:r>
           </w:p>
         </w:tc>
@@ -3054,7 +3054,7 @@
                 <w:b w:val="0"/>
                 <w:sz w:val="18"/>
               </w:rPr>
-              <w:t>2.24</w:t>
+              <w:t>2.26</w:t>
             </w:r>
           </w:p>
         </w:tc>
@@ -3121,7 +3121,7 @@
                 <w:b w:val="0"/>
                 <w:sz w:val="18"/>
               </w:rPr>
-              <w:t>+292.47</w:t>
+              <w:t>+283.71</w:t>
             </w:r>
           </w:p>
         </w:tc>
@@ -3152,7 +3152,7 @@
                 <w:b w:val="0"/>
                 <w:sz w:val="18"/>
               </w:rPr>
-              <w:t>2.24</w:t>
+              <w:t>2.26</w:t>
             </w:r>
           </w:p>
         </w:tc>
@@ -3219,7 +3219,7 @@
                 <w:b w:val="0"/>
                 <w:sz w:val="18"/>
               </w:rPr>
-              <w:t>+274.08</w:t>
+              <w:t>+265.13</w:t>
             </w:r>
           </w:p>
         </w:tc>
@@ -3250,7 +3250,7 @@
                 <w:b w:val="0"/>
                 <w:sz w:val="18"/>
               </w:rPr>
-              <w:t>2.24</w:t>
+              <w:t>2.26</w:t>
             </w:r>
           </w:p>
         </w:tc>
@@ -3375,7 +3375,7 @@
           <w:rFonts w:ascii="Consolas" w:hAnsi="Consolas"/>
           <w:sz w:val="17"/>
         </w:rPr>
-        <w:t>python Scripts/run_example_suite.py --output outputs/examples --workers 2</w:t>
+        <w:t>python Scripts/run_example_suite.py --sample-rate 50 --output outputs/examples --workers 2</w:t>
       </w:r>
     </w:p>
     <w:p>
@@ -3436,7 +3436,7 @@
           <w:rFonts w:ascii="Consolas" w:hAnsi="Consolas"/>
           <w:sz w:val="17"/>
         </w:rPr>
-        <w:t>.venv\Scripts\python.exe Scripts/run_example_suite.py --output outputs/examples --workers 2</w:t>
+        <w:t>.venv\Scripts\python.exe Scripts/run_example_suite.py --sample-rate 50 --output outputs/examples --workers 2</w:t>
       </w:r>
     </w:p>
     <w:p>

</xml_diff>